<commit_message>
Retificação dos números de estudantes
</commit_message>
<xml_diff>
--- a/Lista.docx
+++ b/Lista.docx
@@ -162,7 +162,7 @@
               <w:rPr>
                 <w:rFonts w:ascii="Times New Roman" w:hAnsi="Times New Roman" w:cs="Times New Roman"/>
               </w:rPr>
-              <w:t>217096</w:t>
+              <w:t>220926</w:t>
             </w:r>
           </w:p>
         </w:tc>
@@ -197,6 +197,12 @@
                 <w:rFonts w:ascii="Times New Roman" w:hAnsi="Times New Roman" w:cs="Times New Roman"/>
               </w:rPr>
             </w:pPr>
+            <w:r>
+              <w:rPr>
+                <w:rFonts w:ascii="Times New Roman" w:hAnsi="Times New Roman" w:cs="Times New Roman"/>
+              </w:rPr>
+              <w:t>217096</w:t>
+            </w:r>
           </w:p>
         </w:tc>
         <w:tc>
@@ -347,6 +353,12 @@
                 <w:rFonts w:ascii="Times New Roman" w:hAnsi="Times New Roman" w:cs="Times New Roman"/>
               </w:rPr>
             </w:pPr>
+            <w:r>
+              <w:rPr>
+                <w:rFonts w:ascii="Times New Roman" w:hAnsi="Times New Roman" w:cs="Times New Roman"/>
+              </w:rPr>
+              <w:t>220596</w:t>
+            </w:r>
           </w:p>
         </w:tc>
         <w:tc>

</xml_diff>

<commit_message>
Lista Final de Integrantes do Grupo
</commit_message>
<xml_diff>
--- a/Lista.docx
+++ b/Lista.docx
@@ -162,7 +162,7 @@
               <w:rPr>
                 <w:rFonts w:ascii="Times New Roman" w:hAnsi="Times New Roman" w:cs="Times New Roman"/>
               </w:rPr>
-              <w:t>217096</w:t>
+              <w:t>220926</w:t>
             </w:r>
           </w:p>
         </w:tc>
@@ -180,8 +180,16 @@
               <w:rPr>
                 <w:rFonts w:ascii="Times New Roman" w:hAnsi="Times New Roman" w:cs="Times New Roman"/>
               </w:rPr>
-              <w:t>Agostinho Kambili</w:t>
-            </w:r>
+              <w:t xml:space="preserve">Agostinho </w:t>
+            </w:r>
+            <w:proofErr w:type="spellStart"/>
+            <w:r>
+              <w:rPr>
+                <w:rFonts w:ascii="Times New Roman" w:hAnsi="Times New Roman" w:cs="Times New Roman"/>
+              </w:rPr>
+              <w:t>Kambili</w:t>
+            </w:r>
+            <w:proofErr w:type="spellEnd"/>
           </w:p>
         </w:tc>
       </w:tr>
@@ -197,6 +205,12 @@
                 <w:rFonts w:ascii="Times New Roman" w:hAnsi="Times New Roman" w:cs="Times New Roman"/>
               </w:rPr>
             </w:pPr>
+            <w:r>
+              <w:rPr>
+                <w:rFonts w:ascii="Times New Roman" w:hAnsi="Times New Roman" w:cs="Times New Roman"/>
+              </w:rPr>
+              <w:t>217096</w:t>
+            </w:r>
           </w:p>
         </w:tc>
         <w:tc>
@@ -252,8 +266,16 @@
               <w:rPr>
                 <w:rFonts w:ascii="Times New Roman" w:hAnsi="Times New Roman" w:cs="Times New Roman"/>
               </w:rPr>
-              <w:t>Januário Sôi</w:t>
-            </w:r>
+              <w:t xml:space="preserve">Januário </w:t>
+            </w:r>
+            <w:proofErr w:type="spellStart"/>
+            <w:r>
+              <w:rPr>
+                <w:rFonts w:ascii="Times New Roman" w:hAnsi="Times New Roman" w:cs="Times New Roman"/>
+              </w:rPr>
+              <w:t>Sôi</w:t>
+            </w:r>
+            <w:proofErr w:type="spellEnd"/>
           </w:p>
         </w:tc>
       </w:tr>
@@ -291,7 +313,21 @@
               <w:rPr>
                 <w:rFonts w:ascii="Times New Roman" w:hAnsi="Times New Roman" w:cs="Times New Roman"/>
               </w:rPr>
-              <w:t>Januário Chissingui Quintas</w:t>
+              <w:t xml:space="preserve">Januário </w:t>
+            </w:r>
+            <w:proofErr w:type="spellStart"/>
+            <w:r>
+              <w:rPr>
+                <w:rFonts w:ascii="Times New Roman" w:hAnsi="Times New Roman" w:cs="Times New Roman"/>
+              </w:rPr>
+              <w:t>Chissingui</w:t>
+            </w:r>
+            <w:proofErr w:type="spellEnd"/>
+            <w:r>
+              <w:rPr>
+                <w:rFonts w:ascii="Times New Roman" w:hAnsi="Times New Roman" w:cs="Times New Roman"/>
+              </w:rPr>
+              <w:t xml:space="preserve"> Quintas</w:t>
             </w:r>
           </w:p>
         </w:tc>
@@ -326,11 +362,19 @@
                 <w:rFonts w:ascii="Times New Roman" w:hAnsi="Times New Roman" w:cs="Times New Roman"/>
               </w:rPr>
             </w:pPr>
-            <w:r>
-              <w:rPr>
-                <w:rFonts w:ascii="Times New Roman" w:hAnsi="Times New Roman" w:cs="Times New Roman"/>
-              </w:rPr>
-              <w:t>Kelson Policarpo</w:t>
+            <w:proofErr w:type="spellStart"/>
+            <w:r>
+              <w:rPr>
+                <w:rFonts w:ascii="Times New Roman" w:hAnsi="Times New Roman" w:cs="Times New Roman"/>
+              </w:rPr>
+              <w:t>Kelson</w:t>
+            </w:r>
+            <w:proofErr w:type="spellEnd"/>
+            <w:r>
+              <w:rPr>
+                <w:rFonts w:ascii="Times New Roman" w:hAnsi="Times New Roman" w:cs="Times New Roman"/>
+              </w:rPr>
+              <w:t xml:space="preserve"> Policarpo</w:t>
             </w:r>
           </w:p>
         </w:tc>
@@ -347,6 +391,12 @@
                 <w:rFonts w:ascii="Times New Roman" w:hAnsi="Times New Roman" w:cs="Times New Roman"/>
               </w:rPr>
             </w:pPr>
+            <w:r>
+              <w:rPr>
+                <w:rFonts w:ascii="Times New Roman" w:hAnsi="Times New Roman" w:cs="Times New Roman"/>
+              </w:rPr>
+              <w:t>220596</w:t>
+            </w:r>
           </w:p>
         </w:tc>
         <w:tc>
@@ -380,6 +430,12 @@
                 <w:rFonts w:ascii="Times New Roman" w:hAnsi="Times New Roman" w:cs="Times New Roman"/>
               </w:rPr>
             </w:pPr>
+            <w:r>
+              <w:rPr>
+                <w:rFonts w:ascii="Times New Roman" w:hAnsi="Times New Roman" w:cs="Times New Roman"/>
+              </w:rPr>
+              <w:t>220155</w:t>
+            </w:r>
           </w:p>
         </w:tc>
         <w:tc>
@@ -474,8 +530,16 @@
               <w:rPr>
                 <w:rFonts w:ascii="Times New Roman" w:hAnsi="Times New Roman" w:cs="Times New Roman"/>
               </w:rPr>
-              <w:t>Paulo Estalóneo</w:t>
-            </w:r>
+              <w:t xml:space="preserve">Paulo </w:t>
+            </w:r>
+            <w:proofErr w:type="spellStart"/>
+            <w:r>
+              <w:rPr>
+                <w:rFonts w:ascii="Times New Roman" w:hAnsi="Times New Roman" w:cs="Times New Roman"/>
+              </w:rPr>
+              <w:t>Estalóneo</w:t>
+            </w:r>
+            <w:proofErr w:type="spellEnd"/>
           </w:p>
         </w:tc>
       </w:tr>

</xml_diff>